<commit_message>
Save the final report as PDF format after a small change
</commit_message>
<xml_diff>
--- a/project_reports/FinalReport/Riveraruiz0608_FinalProject.docx
+++ b/project_reports/FinalReport/Riveraruiz0608_FinalProject.docx
@@ -218,6 +218,22 @@
           <w:sz w:val="22"/>
         </w:rPr>
         <w:t>The project uses a structured pipeline that connects data integration and feature engineering, predictive modeling and interpretability, disaster scenario forecasting, scenario analysis, and policy-response simulation. As shown in the workflow, the analysis begins with detailed local data on population structure, economic conditions, social vulnerability, and disaster exposure. These inputs are transformed into a predictive modeling framework using a chronological train-test design and an interpretable Lasso model. The model is then extended into baseline and disaster scenario forecasts through 2030, allowing hurricane and earthquake shocks to be evaluated across regional and islandwide population paths. The final step applies policy-response simulations to test how combinations of jobs, investment, public safety, and recovery strategies may reduce projected population loss. This design moves the project beyond a descriptive study of decline and turns it into a forecasting and strategic planning framework that connects historical population dynamics to future risks, policy alternatives, and long-term recovery planning.</w:t>
+      </w:r>
+      <w:r>
+        <w:rPr>
+          <w:rFonts w:ascii="Times New Roman" w:hAnsi="Times New Roman" w:cs="Times New Roman"/>
+          <w:color w:val="000000" w:themeColor="text1"/>
+          <w:sz w:val="22"/>
+        </w:rPr>
+        <w:t xml:space="preserve"> </w:t>
+      </w:r>
+      <w:r>
+        <w:rPr>
+          <w:rFonts w:ascii="Times New Roman" w:hAnsi="Times New Roman" w:cs="Times New Roman"/>
+          <w:color w:val="000000" w:themeColor="text1"/>
+          <w:sz w:val="22"/>
+        </w:rPr>
+        <w:t>This workflow is summarized visually in Figure 1, with supplemental details on the data inputs and modeling components provided in Appendix A1 and Appendix A2.</w:t>
       </w:r>
     </w:p>
     <w:p>
@@ -931,7 +947,31 @@
           <w:color w:val="000000" w:themeColor="text1"/>
           <w:sz w:val="22"/>
         </w:rPr>
-        <w:t>The analysis uses a municipal-year panel covering Puerto Rico municipalities and the latest available historical data streams. The modeling dataset is organized at the municipality-year level, with 78 municipalities represented across target-eligible years. Because the modeling target is a 3-year forward population-change measure, the final set of target-eligible years is smaller than the raw historical data range. This design reduces short-term noise and focuses the model on medium-term demographic dynamics rather than one-year volatility.</w:t>
+        <w:t xml:space="preserve">The analysis uses a municipal-year panel beginning in 2010 and covering Puerto Rico’s 78 municipalities across the latest available historical data </w:t>
+      </w:r>
+      <w:r>
+        <w:rPr>
+          <w:rFonts w:ascii="Times New Roman" w:hAnsi="Times New Roman" w:cs="Times New Roman"/>
+          <w:color w:val="000000" w:themeColor="text1"/>
+          <w:sz w:val="22"/>
+        </w:rPr>
+        <w:t>streams.</w:t>
+      </w:r>
+      <w:r>
+        <w:rPr>
+          <w:rFonts w:ascii="Times New Roman" w:hAnsi="Times New Roman" w:cs="Times New Roman"/>
+          <w:color w:val="000000" w:themeColor="text1"/>
+          <w:sz w:val="22"/>
+        </w:rPr>
+        <w:t xml:space="preserve"> The</w:t>
+      </w:r>
+      <w:r>
+        <w:rPr>
+          <w:rFonts w:ascii="Times New Roman" w:hAnsi="Times New Roman" w:cs="Times New Roman"/>
+          <w:color w:val="000000" w:themeColor="text1"/>
+          <w:sz w:val="22"/>
+        </w:rPr>
+        <w:t xml:space="preserve"> modeling dataset is organized at the municipality-year level, with 78 municipalities represented across target-eligible years. Because the modeling target is a 3-year forward population-change measure, the final set of target-eligible years is smaller than the raw historical data range. This design reduces short-term noise and focuses the model on medium-term demographic dynamics rather than one-year volatility.</w:t>
       </w:r>
     </w:p>
     <w:p>
@@ -951,16 +991,14 @@
         </w:rPr>
         <w:t xml:space="preserve">The panel structure is central to the project. Each row represents a municipality </w:t>
       </w:r>
-      <w:proofErr w:type="gramStart"/>
-      <w:r>
-        <w:rPr>
-          <w:rFonts w:ascii="Times New Roman" w:hAnsi="Times New Roman" w:cs="Times New Roman"/>
-          <w:color w:val="000000" w:themeColor="text1"/>
-          <w:sz w:val="22"/>
-        </w:rPr>
-        <w:t>in a given year</w:t>
-      </w:r>
-      <w:proofErr w:type="gramEnd"/>
+      <w:r>
+        <w:rPr>
+          <w:rFonts w:ascii="Times New Roman" w:hAnsi="Times New Roman" w:cs="Times New Roman"/>
+          <w:color w:val="000000" w:themeColor="text1"/>
+          <w:sz w:val="22"/>
+        </w:rPr>
+        <w:t>each year</w:t>
+      </w:r>
       <w:r>
         <w:rPr>
           <w:rFonts w:ascii="Times New Roman" w:hAnsi="Times New Roman" w:cs="Times New Roman"/>
@@ -1166,6 +1204,44 @@
     </w:p>
     <w:p>
       <w:pPr>
+        <w:pStyle w:val="ListBullet"/>
+        <w:numPr>
+          <w:ilvl w:val="0"/>
+          <w:numId w:val="0"/>
+        </w:numPr>
+        <w:spacing w:after="60"/>
+        <w:rPr>
+          <w:rFonts w:ascii="Times New Roman" w:hAnsi="Times New Roman" w:cs="Times New Roman"/>
+          <w:color w:val="000000" w:themeColor="text1"/>
+          <w:sz w:val="22"/>
+        </w:rPr>
+      </w:pPr>
+    </w:p>
+    <w:p>
+      <w:pPr>
+        <w:pStyle w:val="ListBullet"/>
+        <w:numPr>
+          <w:ilvl w:val="0"/>
+          <w:numId w:val="0"/>
+        </w:numPr>
+        <w:spacing w:after="60"/>
+        <w:rPr>
+          <w:rFonts w:ascii="Times New Roman" w:hAnsi="Times New Roman" w:cs="Times New Roman"/>
+          <w:color w:val="000000" w:themeColor="text1"/>
+          <w:sz w:val="22"/>
+        </w:rPr>
+      </w:pPr>
+      <w:r>
+        <w:rPr>
+          <w:rFonts w:ascii="Times New Roman" w:hAnsi="Times New Roman" w:cs="Times New Roman"/>
+          <w:color w:val="000000" w:themeColor="text1"/>
+          <w:sz w:val="22"/>
+        </w:rPr>
+        <w:t>A consolidated summary of these data categories, example sources, and their role in the modeling workflow is provided in Appendix A1. This appendix table is included to make the data pipeline easier to trace from raw source categories to final forecasting inputs.</w:t>
+      </w:r>
+    </w:p>
+    <w:p>
+      <w:pPr>
         <w:pStyle w:val="Heading2"/>
         <w:spacing w:before="120" w:after="80"/>
         <w:rPr>
@@ -1234,7 +1310,16 @@
           <w:color w:val="000000" w:themeColor="text1"/>
           <w:sz w:val="22"/>
         </w:rPr>
-        <w:t>The most important predictors include lagged population change, rolling population-change measures, recent population levels, natural-change context, vulnerability measures, income and employment signals, establishment growth, disaster exposure, and regional indicators. Lagged and rolling features are especially important because population change behaves like a slow-moving process: current outcomes are strongly shaped by prior trajectories.</w:t>
+        <w:t xml:space="preserve">The most important predictors include lagged population change, rolling population-change measures, recent population levels, natural-change context, vulnerability measures, income and employment signals, establishment growth, disaster exposure, and regional indicators. Lagged and rolling features are especially important because </w:t>
+      </w:r>
+      <w:r>
+        <w:rPr>
+          <w:rFonts w:ascii="Times New Roman" w:hAnsi="Times New Roman" w:cs="Times New Roman"/>
+          <w:color w:val="000000" w:themeColor="text1"/>
+          <w:sz w:val="22"/>
+        </w:rPr>
+        <w:lastRenderedPageBreak/>
+        <w:t>population change behaves like a slow-moving process: current outcomes are strongly shaped by prior trajectories.</w:t>
       </w:r>
     </w:p>
     <w:p>
@@ -1255,7 +1340,6 @@
           <w:sz w:val="22"/>
           <w:szCs w:val="22"/>
         </w:rPr>
-        <w:lastRenderedPageBreak/>
         <w:t>2.4 Data Quality, Imputation, and Bias Considerations</w:t>
       </w:r>
     </w:p>
@@ -1292,25 +1376,63 @@
           <w:color w:val="000000" w:themeColor="text1"/>
           <w:sz w:val="22"/>
         </w:rPr>
-        <w:t xml:space="preserve">The data integration process required combining multiple source files that did not share the same structure, time coverage, or reporting format. Population, income, employment, business establishment, public safety, vital-rate, hurricane, earthquake, and social vulnerability data had to be standardized into a common local-year panel before they could support regional and islandwide forecasting. This required harmonizing municipality names, aligning annual records, converting inconsistent numeric fields, checking feature availability, and documenting missingness across the final dataset. Public-safety and some economic indicators required </w:t>
-      </w:r>
-      <w:proofErr w:type="gramStart"/>
-      <w:r>
-        <w:rPr>
-          <w:rFonts w:ascii="Times New Roman" w:hAnsi="Times New Roman" w:cs="Times New Roman"/>
-          <w:color w:val="000000" w:themeColor="text1"/>
-          <w:sz w:val="22"/>
-        </w:rPr>
-        <w:t>particular caution</w:t>
-      </w:r>
-      <w:proofErr w:type="gramEnd"/>
-      <w:r>
-        <w:rPr>
-          <w:rFonts w:ascii="Times New Roman" w:hAnsi="Times New Roman" w:cs="Times New Roman"/>
-          <w:color w:val="000000" w:themeColor="text1"/>
-          <w:sz w:val="22"/>
-        </w:rPr>
-        <w:t xml:space="preserve"> because reporting practices and source coverage vary across years. Rather than allowing these inconsistencies to create artificial spikes or gaps, the notebook applies conservative cleaning and quality checks so that the final modeling dataset reflects meaningful demographic and structural patterns instead of source-format noise.</w:t>
+        <w:t>The data integration process required combining multiple source files that did not share the same structure, time coverage, or reporting format. Population, income, employment, business establishment, public safety, vital-rate, hurricane, earthquake, and social vulnerability data had to be standardized into a common local-year panel before they could support regional and islandwide forecasting. This required harmonizing municipality names, aligning annual records, converting inconsistent numeric fields, checking feature availability, and documenting missingness across the final dataset. Public</w:t>
+      </w:r>
+      <w:r>
+        <w:rPr>
+          <w:rFonts w:ascii="Times New Roman" w:hAnsi="Times New Roman" w:cs="Times New Roman"/>
+          <w:color w:val="000000" w:themeColor="text1"/>
+          <w:sz w:val="22"/>
+        </w:rPr>
+        <w:t xml:space="preserve"> </w:t>
+      </w:r>
+      <w:r>
+        <w:rPr>
+          <w:rFonts w:ascii="Times New Roman" w:hAnsi="Times New Roman" w:cs="Times New Roman"/>
+          <w:color w:val="000000" w:themeColor="text1"/>
+          <w:sz w:val="22"/>
+        </w:rPr>
+        <w:t xml:space="preserve">safety and some economic indicators required </w:t>
+      </w:r>
+      <w:r>
+        <w:rPr>
+          <w:rFonts w:ascii="Times New Roman" w:hAnsi="Times New Roman" w:cs="Times New Roman"/>
+          <w:color w:val="000000" w:themeColor="text1"/>
+          <w:sz w:val="22"/>
+        </w:rPr>
+        <w:t>caution</w:t>
+      </w:r>
+      <w:r>
+        <w:rPr>
+          <w:rFonts w:ascii="Times New Roman" w:hAnsi="Times New Roman" w:cs="Times New Roman"/>
+          <w:color w:val="000000" w:themeColor="text1"/>
+          <w:sz w:val="22"/>
+        </w:rPr>
+        <w:t xml:space="preserve"> because reporting practices and source coverage vary across years. </w:t>
+      </w:r>
+      <w:r>
+        <w:rPr>
+          <w:rFonts w:ascii="Times New Roman" w:hAnsi="Times New Roman" w:cs="Times New Roman"/>
+          <w:color w:val="000000" w:themeColor="text1"/>
+          <w:sz w:val="22"/>
+        </w:rPr>
+        <w:t>Rather than allowing these inconsistencies to create artificial spikes or gaps, the notebook applies conservative cleaning and quality checks so that the final modeling dataset reflects meaningful demographic and structural patterns instead of source</w:t>
+      </w:r>
+      <w:r>
+        <w:rPr>
+          <w:rFonts w:ascii="Times New Roman" w:hAnsi="Times New Roman" w:cs="Times New Roman"/>
+          <w:color w:val="000000" w:themeColor="text1"/>
+          <w:sz w:val="22"/>
+        </w:rPr>
+        <w:t xml:space="preserve"> </w:t>
+      </w:r>
+      <w:r>
+        <w:rPr>
+          <w:rFonts w:ascii="Times New Roman" w:hAnsi="Times New Roman" w:cs="Times New Roman"/>
+          <w:color w:val="000000" w:themeColor="text1"/>
+          <w:sz w:val="22"/>
+        </w:rPr>
+        <w:t>format noise. Appendix A1 provides a compact overview of the major data categories and how each was incorporated into the modeling workflow.</w:t>
       </w:r>
     </w:p>
     <w:p>
@@ -1562,6 +1684,7 @@
           <w:sz w:val="22"/>
           <w:szCs w:val="22"/>
         </w:rPr>
+        <w:lastRenderedPageBreak/>
         <w:t>3.3 Visualization-Based Insights</w:t>
       </w:r>
     </w:p>
@@ -1580,16 +1703,7 @@
           <w:color w:val="000000" w:themeColor="text1"/>
           <w:sz w:val="22"/>
         </w:rPr>
-        <w:t xml:space="preserve">The EDA visualizations support the conclusion that vulnerability and demographic momentum are spatially uneven. Social vulnerability maps highlight that risk is not uniform across Puerto Rico. The southern coast and central mountainous municipalities face different combinations of hazard exposure, infrastructure fragility, and </w:t>
-      </w:r>
-      <w:r>
-        <w:rPr>
-          <w:rFonts w:ascii="Times New Roman" w:hAnsi="Times New Roman" w:cs="Times New Roman"/>
-          <w:color w:val="000000" w:themeColor="text1"/>
-          <w:sz w:val="22"/>
-        </w:rPr>
-        <w:lastRenderedPageBreak/>
-        <w:t>demographic pressure. Vital</w:t>
+        <w:t>The EDA visualizations support the conclusion that vulnerability and demographic momentum are spatially uneven. Social vulnerability maps highlight that risk is not uniform across Puerto Rico. The southern coast and central mountainous municipalities face different combinations of hazard exposure, infrastructure fragility, and demographic pressure. Vital</w:t>
       </w:r>
       <w:r>
         <w:rPr>
@@ -1778,8 +1892,8 @@
           <w:sz w:val="22"/>
         </w:rPr>
         <w:drawing>
-          <wp:inline distT="0" distB="0" distL="0" distR="0" wp14:anchorId="2A6052D3" wp14:editId="4C562199">
-            <wp:extent cx="6035040" cy="3069102"/>
+          <wp:inline distT="0" distB="0" distL="0" distR="0" wp14:anchorId="2A6052D3" wp14:editId="115E2CB0">
+            <wp:extent cx="5731200" cy="2914585"/>
             <wp:effectExtent l="0" t="0" r="0" b="0"/>
             <wp:docPr id="1" name="Picture 1"/>
             <wp:cNvGraphicFramePr>
@@ -1801,7 +1915,7 @@
                   <pic:spPr>
                     <a:xfrm>
                       <a:off x="0" y="0"/>
-                      <a:ext cx="6035040" cy="3069102"/>
+                      <a:ext cx="5822787" cy="2961161"/>
                     </a:xfrm>
                     <a:prstGeom prst="rect">
                       <a:avLst/>
@@ -2490,6 +2604,53 @@
         <w:spacing w:before="120" w:after="80"/>
         <w:rPr>
           <w:rFonts w:ascii="Times New Roman" w:hAnsi="Times New Roman" w:cs="Times New Roman"/>
+          <w:b w:val="0"/>
+          <w:bCs w:val="0"/>
+          <w:color w:val="000000" w:themeColor="text1"/>
+          <w:sz w:val="22"/>
+          <w:szCs w:val="22"/>
+        </w:rPr>
+      </w:pPr>
+      <w:r>
+        <w:rPr>
+          <w:rFonts w:ascii="Times New Roman" w:hAnsi="Times New Roman" w:cs="Times New Roman"/>
+          <w:b w:val="0"/>
+          <w:bCs w:val="0"/>
+          <w:color w:val="000000" w:themeColor="text1"/>
+          <w:sz w:val="22"/>
+          <w:szCs w:val="22"/>
+        </w:rPr>
+        <w:t>A supplemental model</w:t>
+      </w:r>
+      <w:r>
+        <w:rPr>
+          <w:rFonts w:ascii="Times New Roman" w:hAnsi="Times New Roman" w:cs="Times New Roman"/>
+          <w:b w:val="0"/>
+          <w:bCs w:val="0"/>
+          <w:color w:val="000000" w:themeColor="text1"/>
+          <w:sz w:val="22"/>
+          <w:szCs w:val="22"/>
+        </w:rPr>
+        <w:t xml:space="preserve"> </w:t>
+      </w:r>
+      <w:r>
+        <w:rPr>
+          <w:rFonts w:ascii="Times New Roman" w:hAnsi="Times New Roman" w:cs="Times New Roman"/>
+          <w:b w:val="0"/>
+          <w:bCs w:val="0"/>
+          <w:color w:val="000000" w:themeColor="text1"/>
+          <w:sz w:val="22"/>
+          <w:szCs w:val="22"/>
+        </w:rPr>
+        <w:t>selection visual is provided in Appendix A2 to show the comparison across candidate forecasting approaches. This appendix figure supports the selection of the tuned Lasso model as the final forecasting backbone under the chronological evaluation framework.</w:t>
+      </w:r>
+    </w:p>
+    <w:p>
+      <w:pPr>
+        <w:pStyle w:val="Heading2"/>
+        <w:spacing w:before="120" w:after="80"/>
+        <w:rPr>
+          <w:rFonts w:ascii="Times New Roman" w:hAnsi="Times New Roman" w:cs="Times New Roman"/>
           <w:color w:val="000000" w:themeColor="text1"/>
           <w:sz w:val="22"/>
           <w:szCs w:val="22"/>
@@ -2621,10 +2782,83 @@
     </w:p>
     <w:p>
       <w:pPr>
+        <w:pStyle w:val="ListBullet"/>
+        <w:numPr>
+          <w:ilvl w:val="0"/>
+          <w:numId w:val="0"/>
+        </w:numPr>
+        <w:spacing w:after="60"/>
+        <w:rPr>
+          <w:rFonts w:ascii="Times New Roman" w:hAnsi="Times New Roman" w:cs="Times New Roman"/>
+          <w:color w:val="000000" w:themeColor="text1"/>
+          <w:sz w:val="22"/>
+        </w:rPr>
+      </w:pPr>
+    </w:p>
+    <w:p>
+      <w:pPr>
         <w:pStyle w:val="Heading2"/>
         <w:spacing w:before="120" w:after="80"/>
         <w:rPr>
           <w:rFonts w:ascii="Times New Roman" w:hAnsi="Times New Roman" w:cs="Times New Roman"/>
+          <w:b w:val="0"/>
+          <w:bCs w:val="0"/>
+          <w:color w:val="000000" w:themeColor="text1"/>
+          <w:sz w:val="22"/>
+          <w:szCs w:val="22"/>
+        </w:rPr>
+      </w:pPr>
+      <w:r>
+        <w:rPr>
+          <w:rFonts w:ascii="Times New Roman" w:hAnsi="Times New Roman" w:cs="Times New Roman"/>
+          <w:b w:val="0"/>
+          <w:bCs w:val="0"/>
+          <w:color w:val="000000" w:themeColor="text1"/>
+          <w:sz w:val="22"/>
+          <w:szCs w:val="22"/>
+        </w:rPr>
+        <w:t xml:space="preserve">Because the model was evaluated under a </w:t>
+      </w:r>
+      <w:r>
+        <w:rPr>
+          <w:rFonts w:ascii="Times New Roman" w:hAnsi="Times New Roman" w:cs="Times New Roman"/>
+          <w:b w:val="0"/>
+          <w:bCs w:val="0"/>
+          <w:color w:val="000000" w:themeColor="text1"/>
+          <w:sz w:val="22"/>
+          <w:szCs w:val="22"/>
+        </w:rPr>
+        <w:t>time</w:t>
+      </w:r>
+      <w:r>
+        <w:rPr>
+          <w:rFonts w:ascii="Times New Roman" w:hAnsi="Times New Roman" w:cs="Times New Roman"/>
+          <w:b w:val="0"/>
+          <w:bCs w:val="0"/>
+          <w:color w:val="000000" w:themeColor="text1"/>
+          <w:sz w:val="22"/>
+          <w:szCs w:val="22"/>
+        </w:rPr>
+        <w:t>-based</w:t>
+      </w:r>
+      <w:r>
+        <w:rPr>
+          <w:rFonts w:ascii="Times New Roman" w:hAnsi="Times New Roman" w:cs="Times New Roman"/>
+          <w:b w:val="0"/>
+          <w:bCs w:val="0"/>
+          <w:color w:val="000000" w:themeColor="text1"/>
+          <w:sz w:val="22"/>
+          <w:szCs w:val="22"/>
+        </w:rPr>
+        <w:t xml:space="preserve"> split rather than a random split, the Appendix A2 model comparison is useful for interpreting performance as a forecasting result rather than only an in-sample fit comparison.</w:t>
+      </w:r>
+    </w:p>
+    <w:p>
+      <w:pPr>
+        <w:pStyle w:val="Heading2"/>
+        <w:spacing w:before="120" w:after="80"/>
+        <w:rPr>
+          <w:rFonts w:ascii="Times New Roman" w:hAnsi="Times New Roman" w:cs="Times New Roman"/>
           <w:color w:val="000000" w:themeColor="text1"/>
           <w:sz w:val="22"/>
           <w:szCs w:val="22"/>
@@ -2712,6 +2946,7 @@
           <w:sz w:val="22"/>
           <w:szCs w:val="22"/>
         </w:rPr>
+        <w:lastRenderedPageBreak/>
         <w:t>5. Interpretability and Final Model Insights</w:t>
       </w:r>
     </w:p>
@@ -2774,7 +3009,6 @@
           <w:color w:val="000000" w:themeColor="text1"/>
           <w:sz w:val="22"/>
         </w:rPr>
-        <w:lastRenderedPageBreak/>
         <w:t>Natural-change and lagged population conditions are the strongest signals. Municipalities already experiencing sustained decline or a negative birth-death balance are harder to stabilize without substantial migration or structural change.</w:t>
       </w:r>
     </w:p>
@@ -2873,6 +3107,22 @@
         </w:rPr>
         <w:t>A key project insight is that population recovery is not the mirror image of population loss. It may take a much stronger and more sustained economic and recovery signal to bring residents back than it takes for residents to leave after economic stagnation or disaster disruption. This asymmetry is important for policy interpretation: slowing decline is a more realistic near-term goal than full reversal, unless recovery dynamics include meaningful return migration, family support, employment growth, and infrastructure resilience.</w:t>
       </w:r>
+      <w:r>
+        <w:rPr>
+          <w:rFonts w:ascii="Times New Roman" w:hAnsi="Times New Roman" w:cs="Times New Roman"/>
+          <w:color w:val="000000" w:themeColor="text1"/>
+          <w:sz w:val="22"/>
+        </w:rPr>
+        <w:t xml:space="preserve"> </w:t>
+      </w:r>
+      <w:r>
+        <w:rPr>
+          <w:rFonts w:ascii="Times New Roman" w:hAnsi="Times New Roman" w:cs="Times New Roman"/>
+          <w:color w:val="000000" w:themeColor="text1"/>
+          <w:sz w:val="22"/>
+        </w:rPr>
+        <w:t>This asymmetry is also reflected in the recovery-rebound appendix materials, especially Appendix A5 and Appendix A6, where standard policy improvements slow decline but stronger recovery momentum is needed to approach stabilization.</w:t>
+      </w:r>
     </w:p>
     <w:p>
       <w:pPr>
@@ -2988,6 +3238,24 @@
     </w:p>
     <w:p>
       <w:pPr>
+        <w:spacing w:after="120" w:line="259" w:lineRule="auto"/>
+        <w:rPr>
+          <w:rFonts w:ascii="Times New Roman" w:hAnsi="Times New Roman" w:cs="Times New Roman"/>
+          <w:color w:val="000000" w:themeColor="text1"/>
+          <w:sz w:val="22"/>
+        </w:rPr>
+      </w:pPr>
+      <w:r>
+        <w:rPr>
+          <w:rFonts w:ascii="Times New Roman" w:hAnsi="Times New Roman" w:cs="Times New Roman"/>
+          <w:color w:val="000000" w:themeColor="text1"/>
+          <w:sz w:val="22"/>
+        </w:rPr>
+        <w:t>Additional disaster scenario visuals are included in Appendix A8 and Appendix A9 as optional supplements to the main scenario figures. These appendix figures separate the hurricane and earthquake scenario ladders for readers who want to inspect each disaster pathway more directly.</w:t>
+      </w:r>
+    </w:p>
+    <w:p>
+      <w:pPr>
         <w:pStyle w:val="Heading2"/>
         <w:spacing w:before="120" w:after="80"/>
         <w:rPr>
@@ -3022,7 +3290,16 @@
           <w:color w:val="000000" w:themeColor="text1"/>
           <w:sz w:val="22"/>
         </w:rPr>
-        <w:t>The scenario results show that stronger disaster assumptions produce larger projected population losses relative to the baseline forecast. Figure 3 presents the islandwide forecast paths for both the hurricane and earthquake scenario ladders. In both panels, the observed population series shows a long-running decline before the forecast period begins, and the post-forecast scenario lines continue that downward trajectory under different shock assumptions. The hurricane ladder shows the clearest separation between scenarios, with the most severe Maria-like Category 5 case producing the steepest projected decline by 2030. The earthquake ladder also reduces projected population relative to baseline, but the highest-magnitude earthquake cases are closer together, suggesting that the stylized earthquake overlay reaches a practical ceiling at the islandwide scale.</w:t>
+        <w:t>The scenario results show that stronger disaster assumptions produce larger projected population losses relative to the baseline forecast. Figure 3 presents the islandwide forecast paths for both the hurricane and earthquake scenario ladders. In both panels, the observed population series shows a long-running decline before the forecast period begins, and the post-forecast scenario lines continue that downward trajectory under different shock assumptions. The hurricane ladder shows the clearest separation between scenarios, with the most severe Maria-</w:t>
+      </w:r>
+      <w:r>
+        <w:rPr>
+          <w:rFonts w:ascii="Times New Roman" w:hAnsi="Times New Roman" w:cs="Times New Roman"/>
+          <w:color w:val="000000" w:themeColor="text1"/>
+          <w:sz w:val="22"/>
+        </w:rPr>
+        <w:lastRenderedPageBreak/>
+        <w:t>like Category 5 case producing the steepest projected decline by 2030. The earthquake ladder also reduces projected population relative to baseline, but the highest-magnitude earthquake cases are closer together, suggesting that the stylized earthquake overlay reaches a practical ceiling at the islandwide scale.</w:t>
       </w:r>
     </w:p>
     <w:p>
@@ -3086,7 +3363,6 @@
           <w:color w:val="000000" w:themeColor="text1"/>
           <w:sz w:val="22"/>
         </w:rPr>
-        <w:lastRenderedPageBreak/>
         <w:t xml:space="preserve">The Maria-like </w:t>
       </w:r>
       <w:proofErr w:type="spellStart"/>
@@ -3107,16 +3383,6 @@
         </w:rPr>
         <w:t xml:space="preserve"> captures the direction of post-disaster decline, but it tends to overestimate long-run population loss. For that reason, the scenario module should be interpreted as a structured stress-testing framework rather than a precise causal disaster-impact model. Its purpose is to compare how the validated forecasting model responds under different disaster assumptions, not to claim that any single scenario will exactly predict future population outcomes.</w:t>
       </w:r>
-    </w:p>
-    <w:p>
-      <w:pPr>
-        <w:spacing w:after="120" w:line="259" w:lineRule="auto"/>
-        <w:rPr>
-          <w:rFonts w:ascii="Times New Roman" w:hAnsi="Times New Roman" w:cs="Times New Roman"/>
-          <w:color w:val="000000" w:themeColor="text1"/>
-          <w:sz w:val="22"/>
-        </w:rPr>
-      </w:pPr>
     </w:p>
     <w:p>
       <w:pPr>
@@ -3137,16 +3403,16 @@
         <mc:AlternateContent>
           <mc:Choice Requires="wpg">
             <w:drawing>
-              <wp:anchor distT="0" distB="0" distL="114300" distR="114300" simplePos="0" relativeHeight="251665408" behindDoc="0" locked="0" layoutInCell="1" allowOverlap="1" wp14:anchorId="5E7BC553" wp14:editId="54A95015">
+              <wp:anchor distT="0" distB="0" distL="114300" distR="114300" simplePos="0" relativeHeight="251665408" behindDoc="0" locked="0" layoutInCell="1" allowOverlap="1" wp14:anchorId="5E7BC553" wp14:editId="4A72F273">
                 <wp:simplePos x="0" y="0"/>
                 <wp:positionH relativeFrom="column">
-                  <wp:posOffset>27305</wp:posOffset>
+                  <wp:posOffset>130302</wp:posOffset>
                 </wp:positionH>
                 <wp:positionV relativeFrom="paragraph">
-                  <wp:posOffset>51360</wp:posOffset>
+                  <wp:posOffset>202565</wp:posOffset>
                 </wp:positionV>
-                <wp:extent cx="6588000" cy="2127400"/>
-                <wp:effectExtent l="50800" t="25400" r="67310" b="82550"/>
+                <wp:extent cx="6306185" cy="1954530"/>
+                <wp:effectExtent l="50800" t="25400" r="69215" b="77470"/>
                 <wp:wrapNone/>
                 <wp:docPr id="1288291675" name="Group 3"/>
                 <wp:cNvGraphicFramePr/>
@@ -3157,7 +3423,7 @@
                       <wpg:grpSpPr>
                         <a:xfrm>
                           <a:off x="0" y="0"/>
-                          <a:ext cx="6588000" cy="2127400"/>
+                          <a:ext cx="6306185" cy="1954530"/>
                           <a:chOff x="0" y="0"/>
                           <a:chExt cx="6588000" cy="2127400"/>
                         </a:xfrm>
@@ -3275,12 +3541,18 @@
                     </wpg:wgp>
                   </a:graphicData>
                 </a:graphic>
+                <wp14:sizeRelH relativeFrom="margin">
+                  <wp14:pctWidth>0</wp14:pctWidth>
+                </wp14:sizeRelH>
+                <wp14:sizeRelV relativeFrom="margin">
+                  <wp14:pctHeight>0</wp14:pctHeight>
+                </wp14:sizeRelV>
               </wp:anchor>
             </w:drawing>
           </mc:Choice>
           <mc:Fallback>
             <w:pict>
-              <v:group w14:anchorId="4C919C20" id="Group 3" o:spid="_x0000_s1026" style="position:absolute;margin-left:2.15pt;margin-top:4.05pt;width:518.75pt;height:167.5pt;z-index:251665408" coordsize="65880,21274" o:gfxdata="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">
+              <v:group w14:anchorId="30529198" id="Group 3" o:spid="_x0000_s1026" style="position:absolute;margin-left:10.25pt;margin-top:15.95pt;width:496.55pt;height:153.9pt;z-index:251665408;mso-width-relative:margin;mso-height-relative:margin" coordsize="65880,21274" o:gfxdata="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">
                 <v:rect id="Rectangle 1" o:spid="_x0000_s1027" style="position:absolute;width:65880;height:21274;visibility:visible;mso-wrap-style:square;v-text-anchor:middle" o:gfxdata="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" filled="f" strokecolor="black [3040]">
                   <v:shadow on="t" color="black" opacity="22937f" origin=",.5" offset="0,.63889mm"/>
                 </v:rect>
@@ -3397,16 +3669,6 @@
     </w:p>
     <w:p>
       <w:pPr>
-        <w:spacing w:after="120" w:line="259" w:lineRule="auto"/>
-        <w:rPr>
-          <w:rFonts w:ascii="Times New Roman" w:hAnsi="Times New Roman" w:cs="Times New Roman"/>
-          <w:color w:val="000000" w:themeColor="text1"/>
-          <w:sz w:val="22"/>
-        </w:rPr>
-      </w:pPr>
-    </w:p>
-    <w:p>
-      <w:pPr>
         <w:jc w:val="center"/>
         <w:rPr>
           <w:rFonts w:ascii="Times New Roman" w:hAnsi="Times New Roman" w:cs="Times New Roman"/>
@@ -3453,17 +3715,6 @@
     </w:p>
     <w:p>
       <w:pPr>
-        <w:spacing w:after="120" w:line="259" w:lineRule="auto"/>
-        <w:rPr>
-          <w:rFonts w:ascii="Times New Roman" w:hAnsi="Times New Roman" w:cs="Times New Roman"/>
-          <w:color w:val="000000" w:themeColor="text1"/>
-          <w:sz w:val="22"/>
-        </w:rPr>
-      </w:pPr>
-    </w:p>
-    <w:p>
-      <w:pPr>
-        <w:jc w:val="center"/>
         <w:rPr>
           <w:rFonts w:ascii="Times New Roman" w:hAnsi="Times New Roman" w:cs="Times New Roman"/>
           <w:color w:val="000000" w:themeColor="text1"/>
@@ -3480,16 +3731,16 @@
         <mc:AlternateContent>
           <mc:Choice Requires="wpg">
             <w:drawing>
-              <wp:anchor distT="0" distB="0" distL="114300" distR="114300" simplePos="0" relativeHeight="251661312" behindDoc="0" locked="0" layoutInCell="1" allowOverlap="1" wp14:anchorId="25F8BE41" wp14:editId="49D2A82B">
+              <wp:anchor distT="0" distB="0" distL="114300" distR="114300" simplePos="0" relativeHeight="251661312" behindDoc="0" locked="0" layoutInCell="1" allowOverlap="1" wp14:anchorId="25F8BE41" wp14:editId="1D4AA5AE">
                 <wp:simplePos x="0" y="0"/>
                 <wp:positionH relativeFrom="column">
-                  <wp:posOffset>149800</wp:posOffset>
+                  <wp:posOffset>443865</wp:posOffset>
                 </wp:positionH>
                 <wp:positionV relativeFrom="paragraph">
-                  <wp:posOffset>150475</wp:posOffset>
+                  <wp:posOffset>220345</wp:posOffset>
                 </wp:positionV>
-                <wp:extent cx="5817600" cy="2779200"/>
-                <wp:effectExtent l="50800" t="25400" r="62865" b="78740"/>
+                <wp:extent cx="5579600" cy="2487400"/>
+                <wp:effectExtent l="50800" t="25400" r="59690" b="78105"/>
                 <wp:wrapNone/>
                 <wp:docPr id="2113334765" name="Group 2"/>
                 <wp:cNvGraphicFramePr/>
@@ -3500,7 +3751,7 @@
                       <wpg:grpSpPr>
                         <a:xfrm>
                           <a:off x="0" y="0"/>
-                          <a:ext cx="5817600" cy="2779200"/>
+                          <a:ext cx="5579600" cy="2487400"/>
                           <a:chOff x="0" y="0"/>
                           <a:chExt cx="5817600" cy="2779200"/>
                         </a:xfrm>
@@ -3694,12 +3945,18 @@
                     </wpg:wgp>
                   </a:graphicData>
                 </a:graphic>
+                <wp14:sizeRelH relativeFrom="margin">
+                  <wp14:pctWidth>0</wp14:pctWidth>
+                </wp14:sizeRelH>
+                <wp14:sizeRelV relativeFrom="margin">
+                  <wp14:pctHeight>0</wp14:pctHeight>
+                </wp14:sizeRelV>
               </wp:anchor>
             </w:drawing>
           </mc:Choice>
           <mc:Fallback>
             <w:pict>
-              <v:group w14:anchorId="4FFC01BE" id="Group 2" o:spid="_x0000_s1026" style="position:absolute;margin-left:11.8pt;margin-top:11.85pt;width:458.1pt;height:218.85pt;z-index:251661312" coordsize="58176,27792" o:gfxdata="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">
+              <v:group w14:anchorId="270D3F27" id="Group 2" o:spid="_x0000_s1026" style="position:absolute;margin-left:34.95pt;margin-top:17.35pt;width:439.35pt;height:195.85pt;z-index:251661312;mso-width-relative:margin;mso-height-relative:margin" coordsize="58176,27792" o:gfxdata="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">
                 <v:rect id="Rectangle 1" o:spid="_x0000_s1027" style="position:absolute;width:58176;height:27792;visibility:visible;mso-wrap-style:square;v-text-anchor:middle" o:gfxdata="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" filled="f" strokecolor="black [3040]">
                   <v:shadow on="t" color="black" opacity="22937f" origin=",.5" offset="0,.63889mm"/>
                 </v:rect>
@@ -3793,16 +4050,6 @@
     </w:p>
     <w:p>
       <w:pPr>
-        <w:jc w:val="center"/>
-        <w:rPr>
-          <w:rFonts w:ascii="Times New Roman" w:hAnsi="Times New Roman" w:cs="Times New Roman"/>
-          <w:color w:val="000000" w:themeColor="text1"/>
-          <w:sz w:val="22"/>
-        </w:rPr>
-      </w:pPr>
-    </w:p>
-    <w:p>
-      <w:pPr>
         <w:rPr>
           <w:rFonts w:ascii="Times New Roman" w:hAnsi="Times New Roman" w:cs="Times New Roman"/>
           <w:color w:val="000000" w:themeColor="text1"/>
@@ -3874,6 +4121,7 @@
           <w:sz w:val="22"/>
           <w:szCs w:val="22"/>
         </w:rPr>
+        <w:lastRenderedPageBreak/>
         <w:t>6.3 Interpretation</w:t>
       </w:r>
     </w:p>
@@ -3892,16 +4140,23 @@
           <w:color w:val="000000" w:themeColor="text1"/>
           <w:sz w:val="22"/>
         </w:rPr>
-        <w:t xml:space="preserve">The scenario results strengthen the central interpretation of the project: disasters amplify existing population trends rather than creating demographic decline from scratch. The islandwide forecast paths show that baseline decline is already present before disaster shocks are introduced, while the hurricane and earthquake scenario ladders push those existing trajectories downward at different intensities. This means that disasters should be </w:t>
-      </w:r>
-      <w:r>
-        <w:rPr>
-          <w:rFonts w:ascii="Times New Roman" w:hAnsi="Times New Roman" w:cs="Times New Roman"/>
-          <w:color w:val="000000" w:themeColor="text1"/>
-          <w:sz w:val="22"/>
-        </w:rPr>
-        <w:lastRenderedPageBreak/>
-        <w:t>interpreted as accelerants within an already fragile demographic system, not as isolated events that fully explain Puerto Rico’s population losses on their own.</w:t>
+        <w:t>The scenario results strengthen the central interpretation of the project: disasters amplify existing population trends rather than creating demographic decline from scratch. The islandwide forecast paths show that baseline decline is already present before disaster shocks are introduced, while the hurricane and earthquake scenario ladders push those existing trajectories downward at different intensities. This means that disasters should be interpreted as accelerants within an already fragile demographic system, not as isolated events that fully explain Puerto Rico’s population losses on their own.</w:t>
+      </w:r>
+      <w:r>
+        <w:rPr>
+          <w:rFonts w:ascii="Times New Roman" w:hAnsi="Times New Roman" w:cs="Times New Roman"/>
+          <w:color w:val="000000" w:themeColor="text1"/>
+          <w:sz w:val="22"/>
+        </w:rPr>
+        <w:t xml:space="preserve"> </w:t>
+      </w:r>
+      <w:r>
+        <w:rPr>
+          <w:rFonts w:ascii="Times New Roman" w:hAnsi="Times New Roman" w:cs="Times New Roman"/>
+          <w:color w:val="000000" w:themeColor="text1"/>
+          <w:sz w:val="22"/>
+        </w:rPr>
+        <w:t>The lead-lag evidence in Appendix A3 and the separate disaster scenario supplements in Appendix A8 and Appendix A9 reinforce this interpretation by showing that disaster effects are better understood through timing, persistence, and scenario intensity rather than as simple one-period shocks.</w:t>
       </w:r>
     </w:p>
     <w:p>
@@ -4199,6 +4454,7 @@
           <w:color w:val="000000" w:themeColor="text1"/>
           <w:sz w:val="22"/>
         </w:rPr>
+        <w:lastRenderedPageBreak/>
         <w:t>Recovery Bundle: applies stronger model-implied improvements through the fitted feature space.</w:t>
       </w:r>
     </w:p>
@@ -4257,16 +4513,7 @@
           <w:color w:val="000000" w:themeColor="text1"/>
           <w:sz w:val="22"/>
         </w:rPr>
-        <w:t xml:space="preserve">Standard policy packages improve outcomes and slow projected decline, but they do not fully reverse the underlying demographic momentum. The retention bundle performs better than isolated policies because it combines multiple levers. Even so, the model remains bounded by strong lagged population dynamics. This </w:t>
-      </w:r>
-      <w:r>
-        <w:rPr>
-          <w:rFonts w:ascii="Times New Roman" w:hAnsi="Times New Roman" w:cs="Times New Roman"/>
-          <w:color w:val="000000" w:themeColor="text1"/>
-          <w:sz w:val="22"/>
-        </w:rPr>
-        <w:lastRenderedPageBreak/>
-        <w:t>means that economic, safety, and vulnerability improvements can shift projections in a favorable direction, but they may not be sufficient to reverse long-run decline without an additional recovery or return-migration dynamic.</w:t>
+        <w:t>Standard policy packages improve outcomes and slow projected decline, but they do not fully reverse the underlying demographic momentum. The retention bundle performs better than isolated policies because it combines multiple levers. Even so, the model remains bounded by strong lagged population dynamics. This means that economic, safety, and vulnerability improvements can shift projections in a favorable direction, but they may not be sufficient to reverse long-run decline without an additional recovery or return-migration dynamic.</w:t>
       </w:r>
     </w:p>
     <w:p>
@@ -4284,7 +4531,7 @@
           <w:color w:val="000000" w:themeColor="text1"/>
           <w:sz w:val="22"/>
         </w:rPr>
-        <w:t>The recovery-rebound sensitivity was designed to clarify the scale of intervention required for stabilization, while also acknowledging uncertainty in the population estimates. The endpoint comparison shows that the standard recovery strategy improves the 2030 projection by approximately 32,352 residents relative to the baseline forecast. However, the recovery-rebound sensitivity produces a much larger shift, reaching approximately 3,253,715 residents by 2030, or about 245,401 more residents than the baseline endpoint. The figure also includes an uncertainty range around the endpoint, showing that the projected population should not be interpreted as an exact number. Instead, it represents an estimated range of plausible outcomes under the modeled assumptions. Unlike the standard policy packages, the rebound case rises slightly above the latest observed population level, suggesting that stabilization or temporary growth would require additional recovery momentum beyond the model-implied policy response, including stronger return migration and sustained structural improvements.</w:t>
+        <w:t>The recovery-rebound sensitivity was designed to clarify the scale of intervention required for stabilization, while also acknowledging uncertainty in the population estimates. The endpoint comparison shows that the standard recovery strategy improves the 2030 projection by approximately 32,352 residents relative to the baseline forecast. However, the recovery-rebound sensitivity produces a much larger shift, reaching approximately 3,253,715 residents by 2030, or about 245,401 more residents than the baseline endpoint. The figure also includes an uncertainty range around the endpoint, showing that the projected population should not be interpreted as an exact number. the standard policy packages, the rebound case rises slightly above the latest observed population level, suggesting that stabilization or temporary growth would require additional recovery momentum beyond the model-implied policy response, including stronger return migration and sustained structural improvements.</w:t>
       </w:r>
     </w:p>
     <w:p>
@@ -4314,9 +4561,9 @@
           <w:sz w:val="22"/>
         </w:rPr>
         <w:drawing>
-          <wp:inline distT="0" distB="0" distL="0" distR="0" wp14:anchorId="631E94AF" wp14:editId="4F01884B">
-            <wp:extent cx="5871556" cy="2541600"/>
-            <wp:effectExtent l="0" t="0" r="0" b="0"/>
+          <wp:inline distT="0" distB="0" distL="0" distR="0" wp14:anchorId="631E94AF" wp14:editId="0F5A5C53">
+            <wp:extent cx="4831200" cy="2091265"/>
+            <wp:effectExtent l="0" t="0" r="0" b="4445"/>
             <wp:docPr id="10" name="Picture 9" descr="A graph and chart with colorful lines&#10;&#10;AI-generated content may be incorrect.">
               <a:extLst xmlns:a="http://schemas.openxmlformats.org/drawingml/2006/main">
                 <a:ext uri="{FF2B5EF4-FFF2-40B4-BE49-F238E27FC236}">
@@ -4352,7 +4599,7 @@
                   <pic:spPr bwMode="auto">
                     <a:xfrm>
                       <a:off x="0" y="0"/>
-                      <a:ext cx="5964687" cy="2581913"/>
+                      <a:ext cx="4852100" cy="2100312"/>
                     </a:xfrm>
                     <a:prstGeom prst="rect">
                       <a:avLst/>
@@ -4375,6 +4622,137 @@
     </w:p>
     <w:p>
       <w:pPr>
+        <w:rPr>
+          <w:rFonts w:ascii="Times New Roman" w:hAnsi="Times New Roman" w:cs="Times New Roman"/>
+          <w:i/>
+          <w:color w:val="000000" w:themeColor="text1"/>
+          <w:sz w:val="22"/>
+        </w:rPr>
+      </w:pPr>
+      <w:r>
+        <w:rPr>
+          <w:rFonts w:ascii="Times New Roman" w:hAnsi="Times New Roman" w:cs="Times New Roman"/>
+          <w:i/>
+          <w:color w:val="000000" w:themeColor="text1"/>
+          <w:sz w:val="22"/>
+        </w:rPr>
+        <w:t xml:space="preserve">Figure </w:t>
+      </w:r>
+      <w:r>
+        <w:rPr>
+          <w:rFonts w:ascii="Times New Roman" w:hAnsi="Times New Roman" w:cs="Times New Roman"/>
+          <w:i/>
+          <w:color w:val="000000" w:themeColor="text1"/>
+          <w:sz w:val="22"/>
+        </w:rPr>
+        <w:t>5</w:t>
+      </w:r>
+      <w:r>
+        <w:rPr>
+          <w:rFonts w:ascii="Times New Roman" w:hAnsi="Times New Roman" w:cs="Times New Roman"/>
+          <w:i/>
+          <w:color w:val="000000" w:themeColor="text1"/>
+          <w:sz w:val="22"/>
+        </w:rPr>
+        <w:t xml:space="preserve">. </w:t>
+      </w:r>
+      <w:r>
+        <w:rPr>
+          <w:rFonts w:ascii="Times New Roman" w:hAnsi="Times New Roman" w:cs="Times New Roman"/>
+          <w:i/>
+          <w:color w:val="000000" w:themeColor="text1"/>
+          <w:sz w:val="22"/>
+        </w:rPr>
+        <w:t>Islandwide Population Recovery Scenarios Under Policy and Return-Migration Sensitivity</w:t>
+      </w:r>
+    </w:p>
+    <w:p>
+      <w:pPr>
+        <w:rPr>
+          <w:rFonts w:ascii="Times New Roman" w:hAnsi="Times New Roman" w:cs="Times New Roman"/>
+          <w:i/>
+          <w:color w:val="000000" w:themeColor="text1"/>
+          <w:sz w:val="22"/>
+        </w:rPr>
+      </w:pPr>
+      <w:r>
+        <w:rPr>
+          <w:noProof/>
+        </w:rPr>
+        <mc:AlternateContent>
+          <mc:Choice Requires="wps">
+            <w:drawing>
+              <wp:anchor distT="0" distB="0" distL="114300" distR="114300" simplePos="0" relativeHeight="251660287" behindDoc="0" locked="0" layoutInCell="1" allowOverlap="1" wp14:anchorId="5D741DDD" wp14:editId="2AF40AD7">
+                <wp:simplePos x="0" y="0"/>
+                <wp:positionH relativeFrom="column">
+                  <wp:posOffset>928045</wp:posOffset>
+                </wp:positionH>
+                <wp:positionV relativeFrom="paragraph">
+                  <wp:posOffset>22165</wp:posOffset>
+                </wp:positionV>
+                <wp:extent cx="4528400" cy="2116175"/>
+                <wp:effectExtent l="50800" t="25400" r="69215" b="81280"/>
+                <wp:wrapNone/>
+                <wp:docPr id="145572384" name="Rectangle 1"/>
+                <wp:cNvGraphicFramePr/>
+                <a:graphic xmlns:a="http://schemas.openxmlformats.org/drawingml/2006/main">
+                  <a:graphicData uri="http://schemas.microsoft.com/office/word/2010/wordprocessingShape">
+                    <wps:wsp>
+                      <wps:cNvSpPr/>
+                      <wps:spPr>
+                        <a:xfrm>
+                          <a:off x="0" y="0"/>
+                          <a:ext cx="4528400" cy="2116175"/>
+                        </a:xfrm>
+                        <a:prstGeom prst="rect">
+                          <a:avLst/>
+                        </a:prstGeom>
+                        <a:noFill/>
+                      </wps:spPr>
+                      <wps:style>
+                        <a:lnRef idx="1">
+                          <a:schemeClr val="dk1"/>
+                        </a:lnRef>
+                        <a:fillRef idx="3">
+                          <a:schemeClr val="dk1"/>
+                        </a:fillRef>
+                        <a:effectRef idx="2">
+                          <a:schemeClr val="dk1"/>
+                        </a:effectRef>
+                        <a:fontRef idx="minor">
+                          <a:schemeClr val="lt1"/>
+                        </a:fontRef>
+                      </wps:style>
+                      <wps:bodyPr rot="0" spcFirstLastPara="0" vertOverflow="overflow" horzOverflow="overflow" vert="horz" wrap="square" lIns="91440" tIns="45720" rIns="91440" bIns="45720" numCol="1" spcCol="0" rtlCol="0" fromWordArt="0" anchor="ctr" anchorCtr="0" forceAA="0" compatLnSpc="1">
+                        <a:prstTxWarp prst="textNoShape">
+                          <a:avLst/>
+                        </a:prstTxWarp>
+                        <a:noAutofit/>
+                      </wps:bodyPr>
+                    </wps:wsp>
+                  </a:graphicData>
+                </a:graphic>
+                <wp14:sizeRelH relativeFrom="margin">
+                  <wp14:pctWidth>0</wp14:pctWidth>
+                </wp14:sizeRelH>
+                <wp14:sizeRelV relativeFrom="margin">
+                  <wp14:pctHeight>0</wp14:pctHeight>
+                </wp14:sizeRelV>
+              </wp:anchor>
+            </w:drawing>
+          </mc:Choice>
+          <mc:Fallback>
+            <w:pict>
+              <v:rect w14:anchorId="24528D20" id="Rectangle 1" o:spid="_x0000_s1026" style="position:absolute;margin-left:73.05pt;margin-top:1.75pt;width:356.55pt;height:166.65pt;z-index:251660287;visibility:visible;mso-wrap-style:square;mso-width-percent:0;mso-height-percent:0;mso-wrap-distance-left:9pt;mso-wrap-distance-top:0;mso-wrap-distance-right:9pt;mso-wrap-distance-bottom:0;mso-position-horizontal:absolute;mso-position-horizontal-relative:text;mso-position-vertical:absolute;mso-position-vertical-relative:text;mso-width-percent:0;mso-height-percent:0;mso-width-relative:margin;mso-height-relative:margin;v-text-anchor:middle" o:gfxdata="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" filled="f" strokecolor="black [3040]">
+                <v:shadow on="t" color="black" opacity="22937f" origin=",.5" offset="0,.63889mm"/>
+              </v:rect>
+            </w:pict>
+          </mc:Fallback>
+        </mc:AlternateContent>
+      </w:r>
+    </w:p>
+    <w:p>
+      <w:pPr>
         <w:jc w:val="center"/>
         <w:rPr>
           <w:rFonts w:ascii="Times New Roman" w:hAnsi="Times New Roman" w:cs="Times New Roman"/>
@@ -4385,60 +4763,14 @@
       <w:r>
         <w:rPr>
           <w:rFonts w:ascii="Times New Roman" w:hAnsi="Times New Roman" w:cs="Times New Roman"/>
-          <w:i/>
-          <w:color w:val="000000" w:themeColor="text1"/>
-          <w:sz w:val="22"/>
-        </w:rPr>
-        <w:t xml:space="preserve">Figure </w:t>
-      </w:r>
-      <w:r>
-        <w:rPr>
-          <w:rFonts w:ascii="Times New Roman" w:hAnsi="Times New Roman" w:cs="Times New Roman"/>
-          <w:i/>
-          <w:color w:val="000000" w:themeColor="text1"/>
-          <w:sz w:val="22"/>
-        </w:rPr>
-        <w:t>5</w:t>
-      </w:r>
-      <w:r>
-        <w:rPr>
-          <w:rFonts w:ascii="Times New Roman" w:hAnsi="Times New Roman" w:cs="Times New Roman"/>
-          <w:i/>
-          <w:color w:val="000000" w:themeColor="text1"/>
-          <w:sz w:val="22"/>
-        </w:rPr>
-        <w:t xml:space="preserve">. </w:t>
-      </w:r>
-      <w:r>
-        <w:rPr>
-          <w:rFonts w:ascii="Times New Roman" w:hAnsi="Times New Roman" w:cs="Times New Roman"/>
-          <w:i/>
-          <w:color w:val="000000" w:themeColor="text1"/>
-          <w:sz w:val="22"/>
-        </w:rPr>
-        <w:t>Islandwide Population Recovery Scenarios Under Policy and Return-Migration Sensitivity</w:t>
-      </w:r>
-    </w:p>
-    <w:p>
-      <w:pPr>
-        <w:jc w:val="center"/>
-        <w:rPr>
-          <w:rFonts w:ascii="Times New Roman" w:hAnsi="Times New Roman" w:cs="Times New Roman"/>
-          <w:color w:val="000000" w:themeColor="text1"/>
-          <w:sz w:val="22"/>
-        </w:rPr>
-      </w:pPr>
-      <w:r>
-        <w:rPr>
-          <w:rFonts w:ascii="Times New Roman" w:hAnsi="Times New Roman" w:cs="Times New Roman"/>
           <w:noProof/>
           <w:color w:val="000000" w:themeColor="text1"/>
           <w:sz w:val="22"/>
         </w:rPr>
         <w:drawing>
-          <wp:inline distT="0" distB="0" distL="0" distR="0" wp14:anchorId="3FEDEF78" wp14:editId="6E65F0F3">
-            <wp:extent cx="5212288" cy="2377360"/>
-            <wp:effectExtent l="0" t="0" r="0" b="0"/>
+          <wp:inline distT="0" distB="0" distL="0" distR="0" wp14:anchorId="3FEDEF78" wp14:editId="2EE004EA">
+            <wp:extent cx="3835946" cy="1749600"/>
+            <wp:effectExtent l="0" t="0" r="0" b="3175"/>
             <wp:docPr id="8" name="Picture 7" descr="A graph and chart with colorful lines&#10;&#10;AI-generated content may be incorrect.">
               <a:extLst xmlns:a="http://schemas.openxmlformats.org/drawingml/2006/main">
                 <a:ext uri="{FF2B5EF4-FFF2-40B4-BE49-F238E27FC236}">
@@ -4474,7 +4806,7 @@
                   <pic:spPr bwMode="auto">
                     <a:xfrm>
                       <a:off x="0" y="0"/>
-                      <a:ext cx="5365575" cy="2447275"/>
+                      <a:ext cx="4125670" cy="1881745"/>
                     </a:xfrm>
                     <a:prstGeom prst="rect">
                       <a:avLst/>
@@ -4637,6 +4969,22 @@
         </w:rPr>
         <w:t>The policy analysis is the most actionable component of the project. It suggests that isolated policy interventions are unlikely to reverse population loss by themselves. A more effective approach would combine job creation, public safety, vulnerability reduction, family support, housing and infrastructure recovery, and return-migration incentives. The model also suggests that policy design should be place-sensitive: municipalities with different baseline conditions may require different intervention intensity and sequencing.</w:t>
       </w:r>
+      <w:r>
+        <w:rPr>
+          <w:rFonts w:ascii="Times New Roman" w:hAnsi="Times New Roman" w:cs="Times New Roman"/>
+          <w:color w:val="000000" w:themeColor="text1"/>
+          <w:sz w:val="22"/>
+        </w:rPr>
+        <w:t xml:space="preserve"> </w:t>
+      </w:r>
+      <w:r>
+        <w:rPr>
+          <w:rFonts w:ascii="Times New Roman" w:hAnsi="Times New Roman" w:cs="Times New Roman"/>
+          <w:color w:val="000000" w:themeColor="text1"/>
+          <w:sz w:val="22"/>
+        </w:rPr>
+        <w:t>The regional policy figures in Appendix A6 and Appendix A7 further support this place-sensitive interpretation by showing that recovery paths and retained-resident gains vary across regions rather than improving uniformly across Puerto Rico.</w:t>
+      </w:r>
     </w:p>
     <w:p>
       <w:pPr>
@@ -4827,7 +5175,7 @@
           <w:color w:val="000000" w:themeColor="text1"/>
           <w:sz w:val="22"/>
         </w:rPr>
-        <w:t xml:space="preserve">Puerto Rico’s population change is persistent, structured, and predictable, but not entirely fixed. Model-based policy analysis suggests that interventions can improve outcomes, especially when they combine economic opportunity, resilience, safety, family support, and recovery capacity. However, stabilizing or increasing </w:t>
+        <w:t xml:space="preserve">Puerto Rico’s population change is persistent, structured, and predictable, but not entirely fixed. Model-based policy analysis suggests that interventions can improve outcomes, especially when they combine economic </w:t>
       </w:r>
       <w:r>
         <w:rPr>
@@ -4836,7 +5184,7 @@
           <w:sz w:val="22"/>
         </w:rPr>
         <w:lastRenderedPageBreak/>
-        <w:t>population likely requires coordinated strategies strong enough to change the underlying demographic trajectory rather than simply offset one or two isolated risk factors.</w:t>
+        <w:t>opportunity, resilience, safety, family support, and recovery capacity. However, stabilizing or increasing population likely requires coordinated strategies strong enough to change the underlying demographic trajectory rather than simply offset one or two isolated risk factors.</w:t>
       </w:r>
     </w:p>
     <w:p>
@@ -4963,13 +5311,227 @@
           <w:numId w:val="0"/>
         </w:numPr>
         <w:spacing w:after="60"/>
-        <w:ind w:left="360" w:hanging="360"/>
-        <w:rPr>
-          <w:rFonts w:ascii="Times New Roman" w:hAnsi="Times New Roman" w:cs="Times New Roman"/>
-          <w:color w:val="000000" w:themeColor="text1"/>
-          <w:sz w:val="22"/>
-        </w:rPr>
-      </w:pPr>
+        <w:rPr>
+          <w:rFonts w:ascii="Times New Roman" w:hAnsi="Times New Roman" w:cs="Times New Roman"/>
+          <w:color w:val="000000" w:themeColor="text1"/>
+          <w:sz w:val="22"/>
+        </w:rPr>
+      </w:pPr>
+    </w:p>
+    <w:p>
+      <w:pPr>
+        <w:pStyle w:val="Heading1"/>
+        <w:spacing w:before="160" w:after="80"/>
+        <w:rPr>
+          <w:rFonts w:ascii="Times New Roman" w:hAnsi="Times New Roman" w:cs="Times New Roman"/>
+          <w:color w:val="000000" w:themeColor="text1"/>
+          <w:sz w:val="24"/>
+          <w:szCs w:val="24"/>
+        </w:rPr>
+      </w:pPr>
+      <w:r>
+        <w:rPr>
+          <w:rFonts w:ascii="Times New Roman" w:hAnsi="Times New Roman" w:cs="Times New Roman"/>
+          <w:color w:val="000000" w:themeColor="text1"/>
+          <w:sz w:val="24"/>
+          <w:szCs w:val="24"/>
+        </w:rPr>
+        <w:t>References</w:t>
+      </w:r>
+    </w:p>
+    <w:p>
+      <w:pPr>
+        <w:pStyle w:val="ListNumber"/>
+        <w:numPr>
+          <w:ilvl w:val="0"/>
+          <w:numId w:val="10"/>
+        </w:numPr>
+        <w:spacing w:after="60"/>
+        <w:rPr>
+          <w:rFonts w:ascii="Times New Roman" w:hAnsi="Times New Roman" w:cs="Times New Roman"/>
+          <w:color w:val="000000" w:themeColor="text1"/>
+          <w:sz w:val="22"/>
+        </w:rPr>
+      </w:pPr>
+      <w:r>
+        <w:rPr>
+          <w:rFonts w:ascii="Times New Roman" w:hAnsi="Times New Roman" w:cs="Times New Roman"/>
+          <w:color w:val="000000" w:themeColor="text1"/>
+          <w:sz w:val="22"/>
+        </w:rPr>
+        <w:t>United States Census Bureau. Population and demographic data used for Puerto Rico municipal analysis, including ACS 5-Year Estimates.</w:t>
+      </w:r>
+    </w:p>
+    <w:p>
+      <w:pPr>
+        <w:pStyle w:val="ListNumber"/>
+        <w:spacing w:after="60"/>
+        <w:rPr>
+          <w:rFonts w:ascii="Times New Roman" w:hAnsi="Times New Roman" w:cs="Times New Roman"/>
+          <w:color w:val="000000" w:themeColor="text1"/>
+          <w:sz w:val="22"/>
+        </w:rPr>
+      </w:pPr>
+      <w:r>
+        <w:rPr>
+          <w:rFonts w:ascii="Times New Roman" w:hAnsi="Times New Roman" w:cs="Times New Roman"/>
+          <w:color w:val="000000" w:themeColor="text1"/>
+          <w:sz w:val="22"/>
+        </w:rPr>
+        <w:t>Puerto Rico Institute of Statistics. Vital statistics and demographic indicators, including birth, death, and natural-change measures.</w:t>
+      </w:r>
+    </w:p>
+    <w:p>
+      <w:pPr>
+        <w:pStyle w:val="ListNumber"/>
+        <w:spacing w:after="60"/>
+        <w:rPr>
+          <w:rFonts w:ascii="Times New Roman" w:hAnsi="Times New Roman" w:cs="Times New Roman"/>
+          <w:color w:val="000000" w:themeColor="text1"/>
+          <w:sz w:val="22"/>
+        </w:rPr>
+      </w:pPr>
+      <w:r>
+        <w:rPr>
+          <w:rFonts w:ascii="Times New Roman" w:hAnsi="Times New Roman" w:cs="Times New Roman"/>
+          <w:color w:val="000000" w:themeColor="text1"/>
+          <w:sz w:val="22"/>
+        </w:rPr>
+        <w:t>Federal Emergency Management Agency (FEMA) and related public hazard data sources. Hurricane, disaster exposure, and recovery data.</w:t>
+      </w:r>
+    </w:p>
+    <w:p>
+      <w:pPr>
+        <w:pStyle w:val="ListNumber"/>
+        <w:spacing w:after="60"/>
+        <w:rPr>
+          <w:rFonts w:ascii="Times New Roman" w:hAnsi="Times New Roman" w:cs="Times New Roman"/>
+          <w:color w:val="000000" w:themeColor="text1"/>
+          <w:sz w:val="22"/>
+        </w:rPr>
+      </w:pPr>
+      <w:r>
+        <w:rPr>
+          <w:rFonts w:ascii="Times New Roman" w:hAnsi="Times New Roman" w:cs="Times New Roman"/>
+          <w:color w:val="000000" w:themeColor="text1"/>
+          <w:sz w:val="22"/>
+        </w:rPr>
+        <w:t>NOAA National Hurricane Center. HURDAT2 hurricane track and intensity database.</w:t>
+      </w:r>
+    </w:p>
+    <w:p>
+      <w:pPr>
+        <w:pStyle w:val="ListNumber"/>
+        <w:spacing w:after="60"/>
+        <w:rPr>
+          <w:rFonts w:ascii="Times New Roman" w:hAnsi="Times New Roman" w:cs="Times New Roman"/>
+          <w:color w:val="000000" w:themeColor="text1"/>
+          <w:sz w:val="22"/>
+        </w:rPr>
+      </w:pPr>
+      <w:r>
+        <w:rPr>
+          <w:rFonts w:ascii="Times New Roman" w:hAnsi="Times New Roman" w:cs="Times New Roman"/>
+          <w:color w:val="000000" w:themeColor="text1"/>
+          <w:sz w:val="22"/>
+        </w:rPr>
+        <w:t>United States Geological Survey (USGS). Earthquake epicenter and magnitude data.</w:t>
+      </w:r>
+    </w:p>
+    <w:p>
+      <w:pPr>
+        <w:pStyle w:val="ListNumber"/>
+        <w:spacing w:after="60"/>
+        <w:rPr>
+          <w:rFonts w:ascii="Times New Roman" w:hAnsi="Times New Roman" w:cs="Times New Roman"/>
+          <w:color w:val="000000" w:themeColor="text1"/>
+          <w:sz w:val="22"/>
+        </w:rPr>
+      </w:pPr>
+      <w:r>
+        <w:rPr>
+          <w:rFonts w:ascii="Times New Roman" w:hAnsi="Times New Roman" w:cs="Times New Roman"/>
+          <w:color w:val="000000" w:themeColor="text1"/>
+          <w:sz w:val="22"/>
+        </w:rPr>
+        <w:t>Centers for Disease Control and Prevention. Social Vulnerability Index documentation and vulnerability concepts.</w:t>
+      </w:r>
+    </w:p>
+    <w:p>
+      <w:pPr>
+        <w:pStyle w:val="ListNumber"/>
+        <w:spacing w:after="60"/>
+        <w:rPr>
+          <w:rFonts w:ascii="Times New Roman" w:hAnsi="Times New Roman" w:cs="Times New Roman"/>
+          <w:color w:val="000000" w:themeColor="text1"/>
+          <w:sz w:val="22"/>
+        </w:rPr>
+      </w:pPr>
+      <w:r>
+        <w:rPr>
+          <w:rFonts w:ascii="Times New Roman" w:hAnsi="Times New Roman" w:cs="Times New Roman"/>
+          <w:color w:val="000000" w:themeColor="text1"/>
+          <w:sz w:val="22"/>
+        </w:rPr>
+        <w:t>Pedregosa, F. et al. (2011). Scikit-learn: Machine Learning in Python. Journal of Machine Learning Research.</w:t>
+      </w:r>
+    </w:p>
+    <w:p>
+      <w:pPr>
+        <w:pStyle w:val="ListNumber"/>
+        <w:spacing w:after="60"/>
+        <w:rPr>
+          <w:rFonts w:ascii="Times New Roman" w:hAnsi="Times New Roman" w:cs="Times New Roman"/>
+          <w:color w:val="000000" w:themeColor="text1"/>
+          <w:sz w:val="22"/>
+        </w:rPr>
+      </w:pPr>
+      <w:r>
+        <w:rPr>
+          <w:rFonts w:ascii="Times New Roman" w:hAnsi="Times New Roman" w:cs="Times New Roman"/>
+          <w:color w:val="000000" w:themeColor="text1"/>
+          <w:sz w:val="22"/>
+        </w:rPr>
+        <w:t>Tibshirani, R. (1996). Regression shrinkage and selection via the lasso. Journal of the Royal Statistical Society.</w:t>
+      </w:r>
+    </w:p>
+    <w:p>
+      <w:pPr>
+        <w:pStyle w:val="ListNumber"/>
+        <w:spacing w:after="60"/>
+        <w:rPr>
+          <w:rFonts w:ascii="Times New Roman" w:hAnsi="Times New Roman" w:cs="Times New Roman"/>
+          <w:color w:val="000000" w:themeColor="text1"/>
+          <w:sz w:val="22"/>
+        </w:rPr>
+      </w:pPr>
+      <w:r>
+        <w:rPr>
+          <w:rFonts w:ascii="Times New Roman" w:hAnsi="Times New Roman" w:cs="Times New Roman"/>
+          <w:color w:val="000000" w:themeColor="text1"/>
+          <w:sz w:val="22"/>
+        </w:rPr>
+        <w:t>Lundberg, S. M., &amp; Lee, S.-I. (2017). A Unified Approach to Interpreting Model Predictions. Advances in Neural Information Processing Systems.</w:t>
+      </w:r>
+    </w:p>
+    <w:p>
+      <w:pPr>
+        <w:pStyle w:val="ListNumber"/>
+        <w:spacing w:after="60"/>
+        <w:rPr>
+          <w:rFonts w:ascii="Times New Roman" w:hAnsi="Times New Roman" w:cs="Times New Roman"/>
+          <w:color w:val="000000" w:themeColor="text1"/>
+          <w:sz w:val="22"/>
+        </w:rPr>
+      </w:pPr>
+      <w:r>
+        <w:rPr>
+          <w:rFonts w:ascii="Times New Roman" w:hAnsi="Times New Roman" w:cs="Times New Roman"/>
+          <w:color w:val="000000" w:themeColor="text1"/>
+          <w:sz w:val="22"/>
+        </w:rPr>
+        <w:t>Course materials and capstone project guidance. Rutgers, The State University of New Jersey, Camden.</w:t>
+      </w:r>
     </w:p>
     <w:p>
       <w:pPr>
@@ -4979,228 +5541,12 @@
           <w:numId w:val="0"/>
         </w:numPr>
         <w:spacing w:after="60"/>
-        <w:ind w:left="360" w:hanging="360"/>
-        <w:rPr>
-          <w:rFonts w:ascii="Times New Roman" w:hAnsi="Times New Roman" w:cs="Times New Roman"/>
-          <w:color w:val="000000" w:themeColor="text1"/>
-          <w:sz w:val="22"/>
-        </w:rPr>
-      </w:pPr>
-    </w:p>
-    <w:p>
-      <w:pPr>
-        <w:pStyle w:val="Heading1"/>
-        <w:spacing w:before="160" w:after="80"/>
-        <w:rPr>
-          <w:rFonts w:ascii="Times New Roman" w:hAnsi="Times New Roman" w:cs="Times New Roman"/>
-          <w:color w:val="000000" w:themeColor="text1"/>
-          <w:sz w:val="24"/>
-          <w:szCs w:val="24"/>
-        </w:rPr>
-      </w:pPr>
-      <w:r>
-        <w:rPr>
-          <w:rFonts w:ascii="Times New Roman" w:hAnsi="Times New Roman" w:cs="Times New Roman"/>
-          <w:color w:val="000000" w:themeColor="text1"/>
-          <w:sz w:val="24"/>
-          <w:szCs w:val="24"/>
-        </w:rPr>
-        <w:t>References</w:t>
-      </w:r>
-    </w:p>
-    <w:p>
-      <w:pPr>
-        <w:pStyle w:val="ListNumber"/>
-        <w:numPr>
-          <w:ilvl w:val="0"/>
-          <w:numId w:val="10"/>
-        </w:numPr>
-        <w:spacing w:after="60"/>
-        <w:rPr>
-          <w:rFonts w:ascii="Times New Roman" w:hAnsi="Times New Roman" w:cs="Times New Roman"/>
-          <w:color w:val="000000" w:themeColor="text1"/>
-          <w:sz w:val="22"/>
-        </w:rPr>
-      </w:pPr>
-      <w:r>
-        <w:rPr>
-          <w:rFonts w:ascii="Times New Roman" w:hAnsi="Times New Roman" w:cs="Times New Roman"/>
-          <w:color w:val="000000" w:themeColor="text1"/>
-          <w:sz w:val="22"/>
-        </w:rPr>
-        <w:t>United States Census Bureau. Population and demographic data used for Puerto Rico municipal analysis, including ACS 5-Year Estimates.</w:t>
-      </w:r>
-    </w:p>
-    <w:p>
-      <w:pPr>
-        <w:pStyle w:val="ListNumber"/>
-        <w:spacing w:after="60"/>
-        <w:rPr>
-          <w:rFonts w:ascii="Times New Roman" w:hAnsi="Times New Roman" w:cs="Times New Roman"/>
-          <w:color w:val="000000" w:themeColor="text1"/>
-          <w:sz w:val="22"/>
-        </w:rPr>
-      </w:pPr>
-      <w:r>
-        <w:rPr>
-          <w:rFonts w:ascii="Times New Roman" w:hAnsi="Times New Roman" w:cs="Times New Roman"/>
-          <w:color w:val="000000" w:themeColor="text1"/>
-          <w:sz w:val="22"/>
-        </w:rPr>
-        <w:t>Puerto Rico Institute of Statistics. Vital statistics and demographic indicators, including birth, death, and natural-change measures.</w:t>
-      </w:r>
-    </w:p>
-    <w:p>
-      <w:pPr>
-        <w:pStyle w:val="ListNumber"/>
-        <w:spacing w:after="60"/>
-        <w:rPr>
-          <w:rFonts w:ascii="Times New Roman" w:hAnsi="Times New Roman" w:cs="Times New Roman"/>
-          <w:color w:val="000000" w:themeColor="text1"/>
-          <w:sz w:val="22"/>
-        </w:rPr>
-      </w:pPr>
-      <w:r>
-        <w:rPr>
-          <w:rFonts w:ascii="Times New Roman" w:hAnsi="Times New Roman" w:cs="Times New Roman"/>
-          <w:color w:val="000000" w:themeColor="text1"/>
-          <w:sz w:val="22"/>
-        </w:rPr>
-        <w:t>Federal Emergency Management Agency (FEMA) and related public hazard data sources. Hurricane, disaster exposure, and recovery data.</w:t>
-      </w:r>
-    </w:p>
-    <w:p>
-      <w:pPr>
-        <w:pStyle w:val="ListNumber"/>
-        <w:spacing w:after="60"/>
-        <w:rPr>
-          <w:rFonts w:ascii="Times New Roman" w:hAnsi="Times New Roman" w:cs="Times New Roman"/>
-          <w:color w:val="000000" w:themeColor="text1"/>
-          <w:sz w:val="22"/>
-        </w:rPr>
-      </w:pPr>
-      <w:r>
-        <w:rPr>
-          <w:rFonts w:ascii="Times New Roman" w:hAnsi="Times New Roman" w:cs="Times New Roman"/>
-          <w:color w:val="000000" w:themeColor="text1"/>
-          <w:sz w:val="22"/>
-        </w:rPr>
-        <w:t>NOAA National Hurricane Center. HURDAT2 hurricane track and intensity database.</w:t>
-      </w:r>
-    </w:p>
-    <w:p>
-      <w:pPr>
-        <w:pStyle w:val="ListNumber"/>
-        <w:spacing w:after="60"/>
-        <w:rPr>
-          <w:rFonts w:ascii="Times New Roman" w:hAnsi="Times New Roman" w:cs="Times New Roman"/>
-          <w:color w:val="000000" w:themeColor="text1"/>
-          <w:sz w:val="22"/>
-        </w:rPr>
-      </w:pPr>
-      <w:r>
-        <w:rPr>
-          <w:rFonts w:ascii="Times New Roman" w:hAnsi="Times New Roman" w:cs="Times New Roman"/>
-          <w:color w:val="000000" w:themeColor="text1"/>
-          <w:sz w:val="22"/>
-        </w:rPr>
-        <w:t>United States Geological Survey (USGS). Earthquake epicenter and magnitude data.</w:t>
-      </w:r>
-    </w:p>
-    <w:p>
-      <w:pPr>
-        <w:pStyle w:val="ListNumber"/>
-        <w:spacing w:after="60"/>
-        <w:rPr>
-          <w:rFonts w:ascii="Times New Roman" w:hAnsi="Times New Roman" w:cs="Times New Roman"/>
-          <w:color w:val="000000" w:themeColor="text1"/>
-          <w:sz w:val="22"/>
-        </w:rPr>
-      </w:pPr>
-      <w:r>
-        <w:rPr>
-          <w:rFonts w:ascii="Times New Roman" w:hAnsi="Times New Roman" w:cs="Times New Roman"/>
-          <w:color w:val="000000" w:themeColor="text1"/>
-          <w:sz w:val="22"/>
-        </w:rPr>
-        <w:t>Centers for Disease Control and Prevention. Social Vulnerability Index documentation and vulnerability concepts.</w:t>
-      </w:r>
-    </w:p>
-    <w:p>
-      <w:pPr>
-        <w:pStyle w:val="ListNumber"/>
-        <w:spacing w:after="60"/>
-        <w:rPr>
-          <w:rFonts w:ascii="Times New Roman" w:hAnsi="Times New Roman" w:cs="Times New Roman"/>
-          <w:color w:val="000000" w:themeColor="text1"/>
-          <w:sz w:val="22"/>
-        </w:rPr>
-      </w:pPr>
-      <w:r>
-        <w:rPr>
-          <w:rFonts w:ascii="Times New Roman" w:hAnsi="Times New Roman" w:cs="Times New Roman"/>
-          <w:color w:val="000000" w:themeColor="text1"/>
-          <w:sz w:val="22"/>
-        </w:rPr>
-        <w:t>Pedregosa, F. et al. (2011). Scikit-learn: Machine Learning in Python. Journal of Machine Learning Research.</w:t>
-      </w:r>
-    </w:p>
-    <w:p>
-      <w:pPr>
-        <w:pStyle w:val="ListNumber"/>
-        <w:spacing w:after="60"/>
-        <w:rPr>
-          <w:rFonts w:ascii="Times New Roman" w:hAnsi="Times New Roman" w:cs="Times New Roman"/>
-          <w:color w:val="000000" w:themeColor="text1"/>
-          <w:sz w:val="22"/>
-        </w:rPr>
-      </w:pPr>
-      <w:r>
-        <w:rPr>
-          <w:rFonts w:ascii="Times New Roman" w:hAnsi="Times New Roman" w:cs="Times New Roman"/>
-          <w:color w:val="000000" w:themeColor="text1"/>
-          <w:sz w:val="22"/>
-        </w:rPr>
-        <w:t>Tibshirani, R. (1996). Regression shrinkage and selection via the lasso. Journal of the Royal Statistical Society.</w:t>
-      </w:r>
-    </w:p>
-    <w:p>
-      <w:pPr>
-        <w:pStyle w:val="ListNumber"/>
-        <w:spacing w:after="60"/>
-        <w:rPr>
-          <w:rFonts w:ascii="Times New Roman" w:hAnsi="Times New Roman" w:cs="Times New Roman"/>
-          <w:color w:val="000000" w:themeColor="text1"/>
-          <w:sz w:val="22"/>
-        </w:rPr>
-      </w:pPr>
-      <w:r>
-        <w:rPr>
-          <w:rFonts w:ascii="Times New Roman" w:hAnsi="Times New Roman" w:cs="Times New Roman"/>
-          <w:color w:val="000000" w:themeColor="text1"/>
-          <w:sz w:val="22"/>
-        </w:rPr>
-        <w:t>Lundberg, S. M., &amp; Lee, S.-I. (2017). A Unified Approach to Interpreting Model Predictions. Advances in Neural Information Processing Systems.</w:t>
-      </w:r>
-    </w:p>
-    <w:p>
-      <w:pPr>
-        <w:pStyle w:val="ListNumber"/>
-        <w:spacing w:after="60"/>
-        <w:rPr>
-          <w:rFonts w:ascii="Times New Roman" w:hAnsi="Times New Roman" w:cs="Times New Roman"/>
-          <w:color w:val="000000" w:themeColor="text1"/>
-          <w:sz w:val="22"/>
-        </w:rPr>
-      </w:pPr>
-      <w:r>
-        <w:rPr>
-          <w:rFonts w:ascii="Times New Roman" w:hAnsi="Times New Roman" w:cs="Times New Roman"/>
-          <w:color w:val="000000" w:themeColor="text1"/>
-          <w:sz w:val="22"/>
-        </w:rPr>
-        <w:t>Course materials and capstone project guidance. Rutgers, The State University of New Jersey, Camden.</w:t>
-      </w:r>
+        <w:rPr>
+          <w:rFonts w:ascii="Times New Roman" w:hAnsi="Times New Roman" w:cs="Times New Roman"/>
+          <w:color w:val="000000" w:themeColor="text1"/>
+          <w:sz w:val="22"/>
+        </w:rPr>
+      </w:pPr>
     </w:p>
     <w:p>
       <w:pPr>
@@ -5392,21 +5738,6 @@
         <w:spacing w:after="60"/>
         <w:rPr>
           <w:rFonts w:ascii="Times New Roman" w:hAnsi="Times New Roman" w:cs="Times New Roman"/>
-          <w:color w:val="000000" w:themeColor="text1"/>
-          <w:sz w:val="22"/>
-        </w:rPr>
-      </w:pPr>
-    </w:p>
-    <w:p>
-      <w:pPr>
-        <w:pStyle w:val="ListBullet"/>
-        <w:numPr>
-          <w:ilvl w:val="0"/>
-          <w:numId w:val="0"/>
-        </w:numPr>
-        <w:spacing w:after="60"/>
-        <w:rPr>
-          <w:rFonts w:ascii="Times New Roman" w:hAnsi="Times New Roman" w:cs="Times New Roman"/>
           <w:b/>
           <w:bCs/>
           <w:color w:val="000000" w:themeColor="text1"/>
@@ -5435,18 +5766,7 @@
           <w:sz w:val="28"/>
           <w:szCs w:val="28"/>
         </w:rPr>
-        <w:t xml:space="preserve">: </w:t>
-      </w:r>
-      <w:r>
-        <w:rPr>
-          <w:rFonts w:ascii="Times New Roman" w:hAnsi="Times New Roman" w:cs="Times New Roman"/>
-          <w:b/>
-          <w:bCs/>
-          <w:color w:val="000000" w:themeColor="text1"/>
-          <w:sz w:val="28"/>
-          <w:szCs w:val="28"/>
-        </w:rPr>
-        <w:t>Supplemental Figures and Tables</w:t>
+        <w:t>: Supplemental Figures and Tables</w:t>
       </w:r>
     </w:p>
     <w:p>

</xml_diff>